<commit_message>
Add Group 12: Amazon KDP project submission
</commit_message>
<xml_diff>
--- a/AJP assigment list.docx
+++ b/AJP assigment list.docx
@@ -416,6 +416,38 @@
       </w:r>
       <w:r>
         <w:t>Online Yoga and Zumba course</w:t>
+      </w:r>
+    </w:p>
+    <w:p/>
+    <w:p>
+      <w:r>
+        <w:t xml:space="preserve">Saurabh Yadav </w:t>
+      </w:r>
+    </w:p>
+    <w:p>
+      <w:r>
+        <w:t xml:space="preserve">Shashank Singh </w:t>
+      </w:r>
+    </w:p>
+    <w:p>
+      <w:r>
+        <w:t xml:space="preserve">Ankit Kumar </w:t>
+      </w:r>
+    </w:p>
+    <w:p>
+      <w:r>
+        <w:t xml:space="preserve">Ayush Khuntiya </w:t>
+      </w:r>
+    </w:p>
+    <w:p>
+      <w:r>
+        <w:t>Ashutosh Kumar Anand</w:t>
+      </w:r>
+      <w:r>
+        <w:t xml:space="preserve">      Topic - </w:t>
+      </w:r>
+      <w:r>
+        <w:t>Amazon KDP</w:t>
       </w:r>
     </w:p>
     <w:p>

</xml_diff>